<commit_message>
fix(master): ingles B1 (intermedio) en cv_master.yaml/md, profile.md, rubric y prompt del agente
- cv_master.yaml + cv_master_es/en.md regenerados con yaml_to_md.py (CI --check OK).
- Ignacio_Palmeri_CV_ES/EN.pdf/docx regenerados desde el master.
- profile.md: prohibido B1+, B2, fluido, avanzado, bilingue (decision Nacho 26/09/2026).
- validate_ats --all: 136 PASS, 0 FAIL.

Co-Authored-By: Claude Sonnet 5 <noreply@anthropic.com>
</commit_message>
<xml_diff>
--- a/CV_Material_Nacho/Ignacio_Palmeri_CV_EN.docx
+++ b/CV_Material_Nacho/Ignacio_Palmeri_CV_EN.docx
@@ -4,12 +4,42 @@
   <w:body>
     <w:p>
       <w:r>
+        <w:rPr>
+          <w:b/>
+          <w:sz w:val="32"/>
+        </w:rPr>
         <w:t>Ignacio Palmeri</w:t>
       </w:r>
     </w:p>
     <w:p>
+      <w:pPr/>
       <w:r>
+        <w:rPr>
+          <w:color w:val="555555"/>
+          <w:sz w:val="17"/>
+        </w:rPr>
         <w:t>Temperley, Buenos Aires, Argentina | +54 9 11 5509-0832 | ignaciopalmeri1@gmail.com | linkedin.com/in/ignaciopalmeri | github.com/nachopalmeri | ignaciopalmeri.vercel.app</w:t>
+      </w:r>
+    </w:p>
+    <w:p>
+      <w:pPr>
+        <w:pStyle w:val="Heading1"/>
+      </w:pPr>
+      <w:r>
+        <w:t>PROFILE</w:t>
+      </w:r>
+    </w:p>
+    <w:p>
+      <w:r>
+        <w:t>B.A. Information Technology Management Student (2nd year) — Seeking part-time internship AI/IT. I build projects combining Python, REST APIs, databases and LLM integrations, and I use AI tools to prototype, review, test and document — always validating the result. I bring high-traffic customer-facing experience, which gives me judgment for real support and process problems before automating them. Seeking a part-time internship (20 h/week) in AI, automation or IT where I can learn by building.</w:t>
+      </w:r>
+    </w:p>
+    <w:p>
+      <w:pPr>
+        <w:pStyle w:val="Heading1"/>
+      </w:pPr>
+      <w:r>
+        <w:t>EDUCATION</w:t>
       </w:r>
     </w:p>
     <w:p>
@@ -17,25 +47,10 @@
         <w:rPr>
           <w:b/>
         </w:rPr>
-        <w:t>PROFILE</w:t>
+        <w:t>B.A. in Information Technology Management — UADE</w:t>
       </w:r>
-    </w:p>
-    <w:p>
       <w:r>
-        <w:t>Second-year (Q4) student of the B.A. in Information Technology Management at UADE (in-person evening classes, Mon–Fri). I build my own projects combining Python, REST APIs, databases and LLM integrations, and I use AI tools to prototype, review, test and document — always validating the final result myself. I bring experience in high-traffic customer-facing operations, which gives me judgment for understanding real support and process problems before automating them. Seeking a part-time internship (20 h/week) in AI, automation or IT where I can learn by building.</w:t>
-      </w:r>
-    </w:p>
-    <w:p>
-      <w:r>
-        <w:rPr>
-          <w:b/>
-        </w:rPr>
-        <w:t>EDUCATION</w:t>
-      </w:r>
-    </w:p>
-    <w:p>
-      <w:r>
-        <w:t>B.A. in Information Technology Management — UADE | Mar 2025 – Expected Dec 2028</w:t>
+        <w:t xml:space="preserve"> | 2025-03 – 2028-12</w:t>
       </w:r>
     </w:p>
     <w:p>
@@ -43,7 +58,7 @@
         <w:pStyle w:val="ListBullet"/>
       </w:pPr>
       <w:r>
-        <w:t>Fourth semester (Q4) in progress, good academic standing. GPA: 8.2/10.</w:t>
+        <w:t>In progress — Q4, good standing. GPA: 8.2/10.</w:t>
       </w:r>
     </w:p>
     <w:p>
@@ -56,7 +71,32 @@
     </w:p>
     <w:p>
       <w:r>
-        <w:t>High School Diploma in Economics &amp; Administration — Colegio Eccleston | Graduated Dec 20, 2024</w:t>
+        <w:rPr>
+          <w:b/>
+        </w:rPr>
+        <w:t>High School Diploma in Economics &amp; Administration — Colegio Eccleston</w:t>
+      </w:r>
+      <w:r>
+        <w:t xml:space="preserve"> | 2020-03 – 2024-12-20</w:t>
+      </w:r>
+    </w:p>
+    <w:p>
+      <w:pPr>
+        <w:pStyle w:val="Heading1"/>
+      </w:pPr>
+      <w:r>
+        <w:t>EXPERIENCE</w:t>
+      </w:r>
+    </w:p>
+    <w:p>
+      <w:r>
+        <w:rPr>
+          <w:b/>
+        </w:rPr>
+        <w:t>Customer Service Representative — Grido (franquicia)</w:t>
+      </w:r>
+      <w:r>
+        <w:t xml:space="preserve"> | 2023-10 – Present</w:t>
       </w:r>
     </w:p>
     <w:p>
@@ -64,28 +104,7 @@
         <w:pStyle w:val="ListBullet"/>
       </w:pPr>
       <w:r>
-        <w:t>GPA: 9.11/10 (official transcript).</w:t>
-      </w:r>
-    </w:p>
-    <w:p>
-      <w:r>
-        <w:rPr>
-          <w:b/>
-        </w:rPr>
-        <w:t>EXPERIENCE</w:t>
-      </w:r>
-    </w:p>
-    <w:p>
-      <w:r>
-        <w:t>Customer Service Representative — Grido (franchise) | Oct 2023 – Present</w:t>
-      </w:r>
-    </w:p>
-    <w:p>
-      <w:pPr>
-        <w:pStyle w:val="ListBullet"/>
-      </w:pPr>
-      <w:r>
-        <w:t>Customer-facing service at a high-traffic point of sale: handling inquiries, resolving issues in real time, billing.</w:t>
+        <w:t>Customer-facing service at high-traffic point of sale.</w:t>
       </w:r>
     </w:p>
     <w:p>
@@ -101,7 +120,7 @@
         <w:pStyle w:val="ListBullet"/>
       </w:pPr>
       <w:r>
-        <w:t>Built my own Excel trackers for sales and inventory follow-up.</w:t>
+        <w:t>Built own Excel trackers for sales and inventory.</w:t>
       </w:r>
     </w:p>
     <w:p>
@@ -113,16 +132,22 @@
       </w:r>
     </w:p>
     <w:p>
+      <w:pPr>
+        <w:pStyle w:val="Heading1"/>
+      </w:pPr>
       <w:r>
-        <w:rPr>
-          <w:b/>
-        </w:rPr>
         <w:t>PROJECTS</w:t>
       </w:r>
     </w:p>
     <w:p>
       <w:r>
-        <w:t>JobBot — AI-assisted job search (Telegram bot + dashboard) | 2026</w:t>
+        <w:rPr>
+          <w:b/>
+        </w:rPr>
+        <w:t>JobBot — AI-assisted job search (Telegram bot + dashboard)</w:t>
+      </w:r>
+      <w:r>
+        <w:t xml:space="preserve"> | 2026</w:t>
       </w:r>
     </w:p>
     <w:p>
@@ -135,7 +160,7 @@
         <w:pStyle w:val="ListBullet"/>
       </w:pPr>
       <w:r>
-        <w:t>Telegram bot that aggregates job postings from multiple sources, filters results and sends scheduled alerts with LLM-generated summaries. I actively used it for my own job search.</w:t>
+        <w:t>Telegram bot aggregating jobs from multiple sources, filtering and sending LLM summaries.</w:t>
       </w:r>
     </w:p>
     <w:p>
@@ -143,7 +168,7 @@
         <w:pStyle w:val="ListBullet"/>
       </w:pPr>
       <w:r>
-        <w:t>Web dashboard with auth (JWT, httpOnly cookies) and a billing layer implemented with Stripe/MercadoPago in test (sandbox) mode. [REVIEW: described by owner as a personal bot, not a finished SaaS; repo shows dashboard + billing. Beta, not live with paying users.]</w:t>
+        <w:t>Web dashboard with JWT/httpOnly auth + sandbox billing.</w:t>
       </w:r>
     </w:p>
     <w:p>
@@ -151,12 +176,18 @@
         <w:pStyle w:val="ListBullet"/>
       </w:pPr>
       <w:r>
-        <w:t>Developed with AI assistance and manually reviewed. https://github.com/nachopalmeri/jobbot</w:t>
+        <w:t>Repo: https://github.com/nachopalmeri/jobbot</w:t>
       </w:r>
     </w:p>
     <w:p>
       <w:r>
-        <w:t>FranquiYA — Full-stack dashboard prototype for franchise operations | 2025 – 2026</w:t>
+        <w:rPr>
+          <w:b/>
+        </w:rPr>
+        <w:t>FranquiYA — Full-stack dashboard prototype for franchise operations</w:t>
+      </w:r>
+      <w:r>
+        <w:t xml:space="preserve"> | 2025 – 2026</w:t>
       </w:r>
     </w:p>
     <w:p>
@@ -169,7 +200,7 @@
         <w:pStyle w:val="ListBullet"/>
       </w:pPr>
       <w:r>
-        <w:t>Prototype dashboard (57 commits) for internal operations: inventory, invoices, employees, shifts, audits and tasks.</w:t>
+        <w:t>57-commit prototype: inventory, invoices, employees, shifts, audits.</w:t>
       </w:r>
     </w:p>
     <w:p>
@@ -177,7 +208,7 @@
         <w:pStyle w:val="ListBullet"/>
       </w:pPr>
       <w:r>
-        <w:t>Designed workflows and requirements around real business operations; REST API backend, Pydantic-validated models and testing (Jest/pytest).</w:t>
+        <w:t>REST API + Pydantic + testing.</w:t>
       </w:r>
     </w:p>
     <w:p>
@@ -185,17 +216,7 @@
         <w:pStyle w:val="ListBullet"/>
       </w:pPr>
       <w:r>
-        <w:t>Public sanitized repository. Demo: https://franqui-ya.vercel.app · https://github.com/nachopalmeri/FranquiYA</w:t>
-      </w:r>
-    </w:p>
-    <w:p>
-      <w:r>
-        <w:t>World Cup 2026 Predictor — Statistical sports prediction engine | 2026</w:t>
-      </w:r>
-    </w:p>
-    <w:p>
-      <w:r>
-        <w:t>Python · NumPy/Pandas · external APIs (Polymarket and other odds sources) · MIT</w:t>
+        <w:t>Repo: https://github.com/nachopalmeri/FranquiYA</w:t>
       </w:r>
     </w:p>
     <w:p>
@@ -203,7 +224,23 @@
         <w:pStyle w:val="ListBullet"/>
       </w:pPr>
       <w:r>
-        <w:t>Match prediction engine for the 2026 World Cup: weighted consensus of 10 sources (including Polymarket as an odds feed), 7×7 Poisson matrix, 10,000 Monte Carlo simulations per group and post-match Elo updates.</w:t>
+        <w:t>Demo: https://franqui-ya.vercel.app</w:t>
+      </w:r>
+    </w:p>
+    <w:p>
+      <w:r>
+        <w:rPr>
+          <w:b/>
+        </w:rPr>
+        <w:t>Prode Mundial 2026 — Statistical sports prediction engine</w:t>
+      </w:r>
+      <w:r>
+        <w:t xml:space="preserve"> | 2026</w:t>
+      </w:r>
+    </w:p>
+    <w:p>
+      <w:r>
+        <w:t>Python · NumPy/Pandas · APIs externas (Polymarket odds) · MIT</w:t>
       </w:r>
     </w:p>
     <w:p>
@@ -211,12 +248,34 @@
         <w:pStyle w:val="ListBullet"/>
       </w:pPr>
       <w:r>
-        <w:t>Automated data pipeline; dashboard deployed on Vercel. https://prode-mundial-2026-ten-omega.vercel.app · https://github.com/nachopalmeri/prode-mundial-2026</w:t>
+        <w:t>Weighted consensus 10 sources, 7x7 Poisson, 10k Monte Carlo simulations.</w:t>
+      </w:r>
+    </w:p>
+    <w:p>
+      <w:pPr>
+        <w:pStyle w:val="ListBullet"/>
+      </w:pPr>
+      <w:r>
+        <w:t>Repo: https://github.com/nachopalmeri/prode-mundial-2026</w:t>
+      </w:r>
+    </w:p>
+    <w:p>
+      <w:pPr>
+        <w:pStyle w:val="ListBullet"/>
+      </w:pPr>
+      <w:r>
+        <w:t>Demo: https://prode-mundial-2026-ten-omega.vercel.app</w:t>
       </w:r>
     </w:p>
     <w:p>
       <w:r>
-        <w:t>PISKU — Python CLI for LLM context management | 2026</w:t>
+        <w:rPr>
+          <w:b/>
+        </w:rPr>
+        <w:t>PISKU — Python CLI for LLM context management</w:t>
+      </w:r>
+      <w:r>
+        <w:t xml:space="preserve"> | 2026</w:t>
       </w:r>
     </w:p>
     <w:p>
@@ -229,20 +288,18 @@
         <w:pStyle w:val="ListBullet"/>
       </w:pPr>
       <w:r>
-        <w:t>Command-line prototype to manage context sent to language models, with configurable tiers and skills.</w:t>
-      </w:r>
-    </w:p>
-    <w:p>
-      <w:pPr>
-        <w:pStyle w:val="ListBullet"/>
-      </w:pPr>
-      <w:r>
-        <w:t>Modular architecture: argument parser, dispatcher, tier manager and context injection. On GitHub; not published on PyPI. [REVIEW: removed the PyPI claim — it does not exist.]</w:t>
+        <w:t>CLI prototype with tier system and configurable skills.</w:t>
       </w:r>
     </w:p>
     <w:p>
       <w:r>
-        <w:t>Agents System — Personal AI-assisted development workflow | 2026</w:t>
+        <w:rPr>
+          <w:b/>
+        </w:rPr>
+        <w:t>Agents System — Personal AI-assisted development workflow</w:t>
+      </w:r>
+      <w:r>
+        <w:t xml:space="preserve"> | 2026</w:t>
       </w:r>
     </w:p>
     <w:p>
@@ -255,7 +312,7 @@
         <w:pStyle w:val="ListBullet"/>
       </w:pPr>
       <w:r>
-        <w:t>System of agents, skills and workflows (73 commits) used as global dotfiles for AI-assisted development: planning, implementation, review, testing and documentation.</w:t>
+        <w:t>73-commit agent/skill/workflow dotfiles system.</w:t>
       </w:r>
     </w:p>
     <w:p>
@@ -263,38 +320,14 @@
         <w:pStyle w:val="ListBullet"/>
       </w:pPr>
       <w:r>
-        <w:t>Responsible AI use: I review, test and adapt everything generated. https://github.com/nachopalmeri/agents-system</w:t>
-      </w:r>
-    </w:p>
-    <w:p>
-      <w:r>
-        <w:rPr>
-          <w:b/>
-        </w:rPr>
-        <w:t>PORTFOLIO</w:t>
+        <w:t>Repo: https://github.com/nachopalmeri/agents-system</w:t>
       </w:r>
     </w:p>
     <w:p>
       <w:pPr>
-        <w:pStyle w:val="ListBullet"/>
+        <w:pStyle w:val="Heading1"/>
       </w:pPr>
       <w:r>
-        <w:t>ignaciopalmeri.vercel.app — portfolio with projects, downloadable CV and work log.</w:t>
-      </w:r>
-    </w:p>
-    <w:p>
-      <w:pPr>
-        <w:pStyle w:val="ListBullet"/>
-      </w:pPr>
-      <w:r>
-        <w:t>github.com/nachopalmeri — 28+ public repos (JobBot, FranquiYA, World Cup 2026 Predictor, Agents System).</w:t>
-      </w:r>
-    </w:p>
-    <w:p>
-      <w:r>
-        <w:rPr>
-          <w:b/>
-        </w:rPr>
         <w:t>TECHNICAL SKILLS</w:t>
       </w:r>
     </w:p>
@@ -303,7 +336,13 @@
         <w:pStyle w:val="ListBullet"/>
       </w:pPr>
       <w:r>
-        <w:t>Languages &amp; frameworks: Python, JavaScript, TypeScript, FastAPI, Next.js, React</w:t>
+        <w:rPr>
+          <w:b/>
+        </w:rPr>
+        <w:t>Languages &amp; frameworks:</w:t>
+      </w:r>
+      <w:r>
+        <w:t xml:space="preserve"> Python, JavaScript, TypeScript, FastAPI, Next.js, React</w:t>
       </w:r>
     </w:p>
     <w:p>
@@ -311,7 +350,13 @@
         <w:pStyle w:val="ListBullet"/>
       </w:pPr>
       <w:r>
-        <w:t>Databases: SQL, PostgreSQL, SQLite</w:t>
+        <w:rPr>
+          <w:b/>
+        </w:rPr>
+        <w:t>Databases:</w:t>
+      </w:r>
+      <w:r>
+        <w:t xml:space="preserve"> SQL, PostgreSQL, SQLite</w:t>
       </w:r>
     </w:p>
     <w:p>
@@ -319,7 +364,13 @@
         <w:pStyle w:val="ListBullet"/>
       </w:pPr>
       <w:r>
-        <w:t>Infrastructure &amp; tools: Linux (RHEL/Ubuntu, WSL2), Git/GitHub, GitHub Actions, Vercel, Railway, Bash</w:t>
+        <w:rPr>
+          <w:b/>
+        </w:rPr>
+        <w:t>Infrastructure &amp; tools:</w:t>
+      </w:r>
+      <w:r>
+        <w:t xml:space="preserve"> Linux (RHEL/Ubuntu, WSL2), Git/GitHub, GitHub Actions, Vercel, Railway, Bash</w:t>
       </w:r>
     </w:p>
     <w:p>
@@ -327,7 +378,13 @@
         <w:pStyle w:val="ListBullet"/>
       </w:pPr>
       <w:r>
-        <w:t>Applied AI: LLM integration (Claude, Groq, Gemini), prompt engineering, agent workflows, process automation, AI-assisted development with review and testing</w:t>
+        <w:rPr>
+          <w:b/>
+        </w:rPr>
+        <w:t>Applied AI:</w:t>
+      </w:r>
+      <w:r>
+        <w:t xml:space="preserve"> LLMs (Claude, Groq, Gemini), prompt engineering, agent workflows, automatización de procesos</w:t>
       </w:r>
     </w:p>
     <w:p>
@@ -335,14 +392,20 @@
         <w:pStyle w:val="ListBullet"/>
       </w:pPr>
       <w:r>
-        <w:t>Business &amp; management: Process modeling, customer service, advanced Excel, working under pressure, agile methodologies</w:t>
+        <w:rPr>
+          <w:b/>
+        </w:rPr>
+        <w:t>Business &amp; management:</w:t>
+      </w:r>
+      <w:r>
+        <w:t xml:space="preserve"> Modelado de procesos, atención al cliente, Excel avanzado, metodologías ágiles</w:t>
       </w:r>
     </w:p>
     <w:p>
+      <w:pPr>
+        <w:pStyle w:val="Heading1"/>
+      </w:pPr>
       <w:r>
-        <w:rPr>
-          <w:b/>
-        </w:rPr>
         <w:t>CERTIFICATIONS</w:t>
       </w:r>
     </w:p>
@@ -351,7 +414,13 @@
         <w:pStyle w:val="ListBullet"/>
       </w:pPr>
       <w:r>
-        <w:t>Red Hat System Administration I (RH124) — Red Hat Academy, 2025. Completed Linux/RHEL administration course.</w:t>
+        <w:rPr>
+          <w:b/>
+        </w:rPr>
+        <w:t>Red Hat System Administration I (RH124)</w:t>
+      </w:r>
+      <w:r>
+        <w:t xml:space="preserve"> — Red Hat Academy, 2025.</w:t>
       </w:r>
     </w:p>
     <w:p>
@@ -359,7 +428,13 @@
         <w:pStyle w:val="ListBullet"/>
       </w:pPr>
       <w:r>
-        <w:t>Claude Code in Action — Anthropic, 2026.</w:t>
+        <w:rPr>
+          <w:b/>
+        </w:rPr>
+        <w:t>Claude Code in Action</w:t>
+      </w:r>
+      <w:r>
+        <w:t xml:space="preserve"> — Anthropic, 2026.</w:t>
       </w:r>
     </w:p>
     <w:p>
@@ -367,7 +442,13 @@
         <w:pStyle w:val="ListBullet"/>
       </w:pPr>
       <w:r>
-        <w:t>CCNA 1: Introduction to Networks (Cisco track) — UADE, in progress, expected completion Dec 2026.</w:t>
+        <w:rPr>
+          <w:b/>
+        </w:rPr>
+        <w:t>CCNA 1: Introduction to Networks</w:t>
+      </w:r>
+      <w:r>
+        <w:t xml:space="preserve"> — Cisco Networking Academy / UADE, 2026.</w:t>
       </w:r>
     </w:p>
     <w:p>
@@ -375,14 +456,14 @@
         <w:pStyle w:val="ListBullet"/>
       </w:pPr>
       <w:r>
-        <w:t>English: B1+/B2 self-assessed, not yet certified. Optional to verify with EF SET (free).</w:t>
+        <w:t>English: B1 (intermediate), self-assessed, not formally certified. I read technical documentation in English.</w:t>
       </w:r>
     </w:p>
     <w:p>
+      <w:pPr>
+        <w:pStyle w:val="Heading1"/>
+      </w:pPr>
       <w:r>
-        <w:rPr>
-          <w:b/>
-        </w:rPr>
         <w:t>LANGUAGES</w:t>
       </w:r>
     </w:p>
@@ -391,7 +472,7 @@
         <w:pStyle w:val="ListBullet"/>
       </w:pPr>
       <w:r>
-        <w:t>Spanish: native</w:t>
+        <w:t>Spanish: Nativo</w:t>
       </w:r>
     </w:p>
     <w:p>
@@ -399,14 +480,14 @@
         <w:pStyle w:val="ListBullet"/>
       </w:pPr>
       <w:r>
-        <w:t>English: B1+/B2 — fluent technical reading, intermediate written and oral communication. No formal certification yet.</w:t>
+        <w:t>Inglés: B1 (intermediate), self-assessed, not formally certified. I read technical documentation in English</w:t>
       </w:r>
     </w:p>
     <w:p>
+      <w:pPr>
+        <w:pStyle w:val="Heading1"/>
+      </w:pPr>
       <w:r>
-        <w:rPr>
-          <w:b/>
-        </w:rPr>
         <w:t>AVAILABILITY</w:t>
       </w:r>
     </w:p>
@@ -415,23 +496,7 @@
         <w:pStyle w:val="ListBullet"/>
       </w:pPr>
       <w:r>
-        <w:t>Part-time: 20 h/week (ideal). Morning or afternoon shift, Mon–Fri.</w:t>
-      </w:r>
-    </w:p>
-    <w:p>
-      <w:pPr>
-        <w:pStyle w:val="ListBullet"/>
-      </w:pPr>
-      <w:r>
-        <w:t>Hybrid or remote; on-site in Buenos Aires/GBA. Preference: Temperley area and Buenos Aires City.</w:t>
-      </w:r>
-    </w:p>
-    <w:p>
-      <w:pPr>
-        <w:pStyle w:val="ListBullet"/>
-      </w:pPr>
-      <w:r>
-        <w:t>Immediate start.</w:t>
+        <w:t>Part-time 20 h/week (ideal), morning or afternoon Mon-Fri. Hybrid/remote; on-site CABA/GBA. Immediate start.</w:t>
       </w:r>
     </w:p>
     <w:sectPr>
@@ -871,11 +936,11 @@
       <w:outlineLvl w:val="0"/>
     </w:pPr>
     <w:rPr>
-      <w:rFonts w:asciiTheme="majorHAnsi" w:eastAsiaTheme="majorEastAsia" w:hAnsiTheme="majorHAnsi" w:cstheme="majorBidi"/>
+      <w:rFonts w:asciiTheme="majorHAnsi" w:eastAsiaTheme="majorEastAsia" w:hAnsiTheme="majorHAnsi" w:cstheme="majorBidi" w:ascii="Calibri" w:hAnsi="Calibri"/>
       <w:b/>
       <w:bCs/>
-      <w:color w:val="365F91" w:themeColor="accent1" w:themeShade="BF"/>
-      <w:sz w:val="28"/>
+      <w:color w:val="1A1A1A"/>
+      <w:sz w:val="22"/>
       <w:szCs w:val="28"/>
     </w:rPr>
   </w:style>
@@ -895,11 +960,11 @@
       <w:outlineLvl w:val="1"/>
     </w:pPr>
     <w:rPr>
-      <w:rFonts w:asciiTheme="majorHAnsi" w:eastAsiaTheme="majorEastAsia" w:hAnsiTheme="majorHAnsi" w:cstheme="majorBidi"/>
+      <w:rFonts w:asciiTheme="majorHAnsi" w:eastAsiaTheme="majorEastAsia" w:hAnsiTheme="majorHAnsi" w:cstheme="majorBidi" w:ascii="Calibri" w:hAnsi="Calibri"/>
       <w:b/>
       <w:bCs/>
-      <w:color w:val="4F81BD" w:themeColor="accent1"/>
-      <w:sz w:val="26"/>
+      <w:color w:val="1A1A1A"/>
+      <w:sz w:val="20"/>
       <w:szCs w:val="26"/>
     </w:rPr>
   </w:style>

</xml_diff>